<commit_message>
Worked on merges and added refresh when closing a merge.
</commit_message>
<xml_diff>
--- a/project/documents/reportletters/ffNoticeOfAcceptAuNzFp.docx
+++ b/project/documents/reportletters/ffNoticeOfAcceptAuNzFp.docx
@@ -353,31 +353,13 @@
         </w:rPr>
         <w:t>&lt;&lt;actionReq&gt;&gt;</w:t>
       </w:r>
-    </w:p>
-    <w:p>
-      <w:pPr>
-        <w:spacing w:after="0" w:line="240" w:lineRule="auto"/>
-        <w:rPr>
-          <w:rFonts w:ascii="Times New Roman" w:hAnsi="Times New Roman"/>
-          <w:sz w:val="24"/>
-          <w:szCs w:val="24"/>
-        </w:rPr>
-      </w:pPr>
-      <w:r>
-        <w:rPr>
-          <w:rFonts w:ascii="Times New Roman" w:hAnsi="Times New Roman"/>
-          <w:sz w:val="24"/>
-          <w:szCs w:val="24"/>
-        </w:rPr>
-        <w:t xml:space="preserve">Deadline Date: </w:t>
-      </w:r>
-      <w:r>
-        <w:rPr>
-          <w:rFonts w:ascii="Times New Roman" w:hAnsi="Times New Roman"/>
-          <w:sz w:val="24"/>
-          <w:szCs w:val="24"/>
-        </w:rPr>
-        <w:t xml:space="preserve"> &lt;&lt;</w:t>
+      <w:r>
+        <w:rPr>
+          <w:rFonts w:ascii="Times New Roman" w:hAnsi="Times New Roman"/>
+          <w:sz w:val="24"/>
+          <w:szCs w:val="24"/>
+        </w:rPr>
+        <w:t>&lt;&lt;</w:t>
       </w:r>
       <w:r>
         <w:rPr>
@@ -393,41 +375,15 @@
           <w:sz w:val="24"/>
           <w:szCs w:val="24"/>
         </w:rPr>
-        <w:t>dueDate&gt;&gt;</w:t>
-      </w:r>
-    </w:p>
-    <w:p>
-      <w:pPr>
-        <w:spacing w:after="0" w:line="240" w:lineRule="auto"/>
-        <w:rPr>
-          <w:rFonts w:ascii="Times New Roman" w:hAnsi="Times New Roman"/>
-          <w:sz w:val="24"/>
-          <w:szCs w:val="24"/>
-        </w:rPr>
-      </w:pPr>
-      <w:r>
-        <w:rPr>
-          <w:rFonts w:ascii="Times New Roman" w:hAnsi="Times New Roman"/>
-          <w:sz w:val="24"/>
-          <w:szCs w:val="24"/>
-        </w:rPr>
-        <w:t>Requested Response</w:t>
-      </w:r>
-      <w:r>
-        <w:rPr>
-          <w:rFonts w:ascii="Times New Roman" w:hAnsi="Times New Roman"/>
-          <w:sz w:val="24"/>
-          <w:szCs w:val="24"/>
-        </w:rPr>
-        <w:t xml:space="preserve"> Date</w:t>
-      </w:r>
-      <w:r>
-        <w:rPr>
-          <w:rFonts w:ascii="Times New Roman" w:hAnsi="Times New Roman"/>
-          <w:sz w:val="24"/>
-          <w:szCs w:val="24"/>
-        </w:rPr>
-        <w:t xml:space="preserve">: </w:t>
+        <w:t>dueDate&gt;</w:t>
+      </w:r>
+      <w:r>
+        <w:rPr>
+          <w:rFonts w:ascii="Times New Roman" w:hAnsi="Times New Roman"/>
+          <w:sz w:val="24"/>
+          <w:szCs w:val="24"/>
+        </w:rPr>
+        <w:t>&gt;</w:t>
       </w:r>
       <w:r>
         <w:rPr>

</xml_diff>